<commit_message>
Add GitHub repo link to all three supporting documents
So judges reading any of the PDFs/docx can click straight through to the
full source code and evidence in the repository.

Co-Authored-By: Claude Sonnet 5 <noreply@anthropic.com>
</commit_message>
<xml_diff>
--- a/docs/CargoFlow_Sentinel_Supporting_Documentation.docx
+++ b/docs/CargoFlow_Sentinel_Supporting_Documentation.docx
@@ -175,6 +175,34 @@
         </w:tc>
       </w:tr>
     </w:tbl>
+    <w:p>
+      <w:pPr>
+        <w:spacing w:after="300"/>
+      </w:pPr>
+    </w:p>
+    <w:p>
+      <w:r>
+        <w:rPr>
+          <w:color w:val="54596A"/>
+          <w:sz w:val="21"/>
+          <w:szCs w:val="21"/>
+        </w:rPr>
+        <w:t xml:space="preserve">Full source code &amp; repository: </w:t>
+      </w:r>
+      <w:hyperlink w:history="1" r:id="rIdlyghujvjic9471cbjeccy">
+        <w:r>
+          <w:rPr>
+            <w:b/>
+            <w:bCs/>
+            <w:color w:val="1B3F8F"/>
+            <w:sz w:val="21"/>
+            <w:szCs w:val="21"/>
+            <w:u w:val="single"/>
+          </w:rPr>
+          <w:t xml:space="preserve">github.com/ssfathimaindia-wq/cargoflow-sentinel</w:t>
+        </w:r>
+      </w:hyperlink>
+    </w:p>
     <w:p>
       <w:r>
         <w:br w:type="page"/>

</xml_diff>

<commit_message>
Document the retry and privacy additions honestly
Adds a "Reliability & Production Considerations" section to both the
Supporting Documentation and the Written Description: retries are real
and built (with the actual code + verification note), privacy/PII
handling is explicitly acknowledged as a known next step rather than
claimed or glossed over. Scope tables updated to reflect both.

Co-Authored-By: Claude Sonnet 5 <noreply@anthropic.com>
</commit_message>
<xml_diff>
--- a/docs/CargoFlow_Sentinel_Supporting_Documentation.docx
+++ b/docs/CargoFlow_Sentinel_Supporting_Documentation.docx
@@ -189,7 +189,7 @@
         </w:rPr>
         <w:t xml:space="preserve">Full source code &amp; repository: </w:t>
       </w:r>
-      <w:hyperlink w:history="1" r:id="rIdlyghujvjic9471cbjeccy">
+      <w:hyperlink w:history="1" r:id="rIdmguf2sc_tsyus5aj903nb">
         <w:r>
           <w:rPr>
             <w:b/>
@@ -2813,7 +2813,329 @@
         <w:spacing w:after="200" w:before="400"/>
       </w:pPr>
       <w:r>
-        <w:t xml:space="preserve">8. Scope — Built vs. Not Yet</w:t>
+        <w:t xml:space="preserve">8. Reliability &amp; Production Considerations</w:t>
+      </w:r>
+    </w:p>
+    <w:p>
+      <w:pPr>
+        <w:spacing w:after="160"/>
+      </w:pPr>
+      <w:r>
+        <w:rPr>
+          <w:sz w:val="21"/>
+          <w:szCs w:val="21"/>
+        </w:rPr>
+        <w:t xml:space="preserve">Two things worth calling out explicitly, since “production-ready” claims are easy to overstate.</w:t>
+      </w:r>
+    </w:p>
+    <w:p>
+      <w:pPr>
+        <w:pStyle w:val="Heading2"/>
+        <w:spacing w:after="150" w:before="300"/>
+      </w:pPr>
+      <w:r>
+        <w:t xml:space="preserve">Retries — built</w:t>
+      </w:r>
+    </w:p>
+    <w:p>
+      <w:pPr>
+        <w:spacing w:after="160"/>
+      </w:pPr>
+      <w:r>
+        <w:rPr>
+          <w:sz w:val="21"/>
+          <w:szCs w:val="21"/>
+        </w:rPr>
+        <w:t xml:space="preserve">Every agent call (agents/agents.py, invoke_agent) is wrapped in exponential-backoff retry logic — but only for genuinely transient failures: rate limits, connection drops, timeouts, and 5xx server errors. Auth and bad-request errors are deliberately never retried, since retrying those just wastes time on an error that fails identically every time.</w:t>
+      </w:r>
+    </w:p>
+    <w:tbl>
+      <w:tblPr>
+        <w:tblW w:type="pct" w:w="100%"/>
+        <w:tblBorders>
+          <w:top w:val="single" w:color="auto" w:sz="4"/>
+          <w:left w:val="single" w:color="auto" w:sz="4"/>
+          <w:bottom w:val="single" w:color="auto" w:sz="4"/>
+          <w:right w:val="single" w:color="auto" w:sz="4"/>
+          <w:insideH w:val="single" w:color="auto" w:sz="4"/>
+          <w:insideV w:val="single" w:color="auto" w:sz="4"/>
+        </w:tblBorders>
+      </w:tblPr>
+      <w:tblGrid>
+        <w:gridCol w:w="100"/>
+      </w:tblGrid>
+      <w:tr>
+        <w:tc>
+          <w:tcPr>
+            <w:tcW w:type="pct" w:w="100%"/>
+            <w:shd w:fill="1A2029" w:val="clear"/>
+            <w:tcMar>
+              <w:top w:type="dxa" w:w="180"/>
+              <w:left w:type="dxa" w:w="220"/>
+              <w:bottom w:type="dxa" w:w="180"/>
+              <w:right w:type="dxa" w:w="220"/>
+            </w:tcMar>
+          </w:tcPr>
+          <w:p>
+            <w:pPr>
+              <w:spacing w:after="20"/>
+            </w:pPr>
+            <w:r>
+              <w:rPr>
+                <w:rFonts w:ascii="Consolas" w:cs="Consolas" w:eastAsia="Consolas" w:hAnsi="Consolas"/>
+                <w:color w:val="EDEBE1"/>
+                <w:sz w:val="18"/>
+                <w:szCs w:val="18"/>
+              </w:rPr>
+              <w:t xml:space="preserve">RETRYABLE_ERRORS = (RateLimitError, APIConnectionError,</w:t>
+            </w:r>
+          </w:p>
+          <w:p>
+            <w:pPr>
+              <w:spacing w:after="20"/>
+            </w:pPr>
+            <w:r>
+              <w:rPr>
+                <w:rFonts w:ascii="Consolas" w:cs="Consolas" w:eastAsia="Consolas" w:hAnsi="Consolas"/>
+                <w:color w:val="EDEBE1"/>
+                <w:sz w:val="18"/>
+                <w:szCs w:val="18"/>
+              </w:rPr>
+              <w:t xml:space="preserve">                     APITimeoutError, InternalServerError)</w:t>
+            </w:r>
+          </w:p>
+          <w:p>
+            <w:pPr>
+              <w:spacing w:after="20"/>
+            </w:pPr>
+            <w:r>
+              <w:rPr>
+                <w:rFonts w:ascii="Consolas" w:cs="Consolas" w:eastAsia="Consolas" w:hAnsi="Consolas"/>
+                <w:color w:val="EDEBE1"/>
+                <w:sz w:val="18"/>
+                <w:szCs w:val="18"/>
+              </w:rPr>
+              <w:t xml:space="preserve"/>
+            </w:r>
+          </w:p>
+          <w:p>
+            <w:pPr>
+              <w:spacing w:after="20"/>
+            </w:pPr>
+            <w:r>
+              <w:rPr>
+                <w:rFonts w:ascii="Consolas" w:cs="Consolas" w:eastAsia="Consolas" w:hAnsi="Consolas"/>
+                <w:color w:val="EDEBE1"/>
+                <w:sz w:val="18"/>
+                <w:szCs w:val="18"/>
+              </w:rPr>
+              <w:t xml:space="preserve">def _call_with_retries(fn, max_attempts=3, base_delay=1.5):</w:t>
+            </w:r>
+          </w:p>
+          <w:p>
+            <w:pPr>
+              <w:spacing w:after="20"/>
+            </w:pPr>
+            <w:r>
+              <w:rPr>
+                <w:rFonts w:ascii="Consolas" w:cs="Consolas" w:eastAsia="Consolas" w:hAnsi="Consolas"/>
+                <w:color w:val="EDEBE1"/>
+                <w:sz w:val="18"/>
+                <w:szCs w:val="18"/>
+              </w:rPr>
+              <w:t xml:space="preserve">    for attempt in range(1, max_attempts + 1):</w:t>
+            </w:r>
+          </w:p>
+          <w:p>
+            <w:pPr>
+              <w:spacing w:after="20"/>
+            </w:pPr>
+            <w:r>
+              <w:rPr>
+                <w:rFonts w:ascii="Consolas" w:cs="Consolas" w:eastAsia="Consolas" w:hAnsi="Consolas"/>
+                <w:color w:val="EDEBE1"/>
+                <w:sz w:val="18"/>
+                <w:szCs w:val="18"/>
+              </w:rPr>
+              <w:t xml:space="preserve">        try:</w:t>
+            </w:r>
+          </w:p>
+          <w:p>
+            <w:pPr>
+              <w:spacing w:after="20"/>
+            </w:pPr>
+            <w:r>
+              <w:rPr>
+                <w:rFonts w:ascii="Consolas" w:cs="Consolas" w:eastAsia="Consolas" w:hAnsi="Consolas"/>
+                <w:color w:val="EDEBE1"/>
+                <w:sz w:val="18"/>
+                <w:szCs w:val="18"/>
+              </w:rPr>
+              <w:t xml:space="preserve">            return fn()</w:t>
+            </w:r>
+          </w:p>
+          <w:p>
+            <w:pPr>
+              <w:spacing w:after="20"/>
+            </w:pPr>
+            <w:r>
+              <w:rPr>
+                <w:rFonts w:ascii="Consolas" w:cs="Consolas" w:eastAsia="Consolas" w:hAnsi="Consolas"/>
+                <w:color w:val="EDEBE1"/>
+                <w:sz w:val="18"/>
+                <w:szCs w:val="18"/>
+              </w:rPr>
+              <w:t xml:space="preserve">        except RETRYABLE_ERRORS as e:</w:t>
+            </w:r>
+          </w:p>
+          <w:p>
+            <w:pPr>
+              <w:spacing w:after="20"/>
+            </w:pPr>
+            <w:r>
+              <w:rPr>
+                <w:rFonts w:ascii="Consolas" w:cs="Consolas" w:eastAsia="Consolas" w:hAnsi="Consolas"/>
+                <w:color w:val="EDEBE1"/>
+                <w:sz w:val="18"/>
+                <w:szCs w:val="18"/>
+              </w:rPr>
+              <w:t xml:space="preserve">            if attempt == max_attempts:</w:t>
+            </w:r>
+          </w:p>
+          <w:p>
+            <w:pPr>
+              <w:spacing w:after="20"/>
+            </w:pPr>
+            <w:r>
+              <w:rPr>
+                <w:rFonts w:ascii="Consolas" w:cs="Consolas" w:eastAsia="Consolas" w:hAnsi="Consolas"/>
+                <w:color w:val="EDEBE1"/>
+                <w:sz w:val="18"/>
+                <w:szCs w:val="18"/>
+              </w:rPr>
+              <w:t xml:space="preserve">                raise</w:t>
+            </w:r>
+          </w:p>
+          <w:p>
+            <w:pPr>
+              <w:spacing w:after="20"/>
+            </w:pPr>
+            <w:r>
+              <w:rPr>
+                <w:rFonts w:ascii="Consolas" w:cs="Consolas" w:eastAsia="Consolas" w:hAnsi="Consolas"/>
+                <w:color w:val="EDEBE1"/>
+                <w:sz w:val="18"/>
+                <w:szCs w:val="18"/>
+              </w:rPr>
+              <w:t xml:space="preserve">            time.sleep(base_delay * (2 ** (attempt - 1)))</w:t>
+            </w:r>
+          </w:p>
+        </w:tc>
+      </w:tr>
+    </w:tbl>
+    <w:p>
+      <w:pPr>
+        <w:spacing w:after="150"/>
+      </w:pPr>
+    </w:p>
+    <w:tbl>
+      <w:tblPr>
+        <w:tblW w:type="pct" w:w="100%"/>
+        <w:tblBorders>
+          <w:top w:val="single" w:color="auto" w:sz="4"/>
+          <w:left w:val="single" w:color="auto" w:sz="4"/>
+          <w:bottom w:val="single" w:color="auto" w:sz="4"/>
+          <w:right w:val="single" w:color="auto" w:sz="4"/>
+          <w:insideH w:val="single" w:color="auto" w:sz="4"/>
+          <w:insideV w:val="single" w:color="auto" w:sz="4"/>
+        </w:tblBorders>
+      </w:tblPr>
+      <w:tblGrid>
+        <w:gridCol w:w="100"/>
+      </w:tblGrid>
+      <w:tr>
+        <w:tc>
+          <w:tcPr>
+            <w:tcW w:type="pct" w:w="100%"/>
+            <w:tcBorders>
+              <w:top w:val="none"/>
+              <w:left w:val="single" w:color="2E7D46" w:sz="24"/>
+              <w:bottom w:val="none"/>
+              <w:right w:val="none"/>
+            </w:tcBorders>
+            <w:shd w:fill="EDF5EC" w:val="clear"/>
+            <w:tcMar>
+              <w:top w:type="dxa" w:w="180"/>
+              <w:left w:type="dxa" w:w="220"/>
+              <w:bottom w:type="dxa" w:w="180"/>
+              <w:right w:type="dxa" w:w="220"/>
+            </w:tcMar>
+          </w:tcPr>
+          <w:p>
+            <w:pPr>
+              <w:spacing w:after="60"/>
+            </w:pPr>
+            <w:r>
+              <w:rPr>
+                <w:b/>
+                <w:bCs/>
+                <w:color w:val="2E7D46"/>
+                <w:sz w:val="20"/>
+                <w:szCs w:val="20"/>
+              </w:rPr>
+              <w:t xml:space="preserve">Verified</w:t>
+            </w:r>
+          </w:p>
+          <w:p>
+            <w:r>
+              <w:rPr>
+                <w:sz w:val="20"/>
+                <w:szCs w:val="20"/>
+              </w:rPr>
+              <w:t xml:space="preserve">Full live workflow.py run and full eval/run_eval.py run, both completed cleanly after this change — no regression.</w:t>
+            </w:r>
+          </w:p>
+        </w:tc>
+      </w:tr>
+    </w:tbl>
+    <w:p>
+      <w:pPr>
+        <w:spacing w:after="150"/>
+      </w:pPr>
+    </w:p>
+    <w:p>
+      <w:pPr>
+        <w:pStyle w:val="Heading2"/>
+        <w:spacing w:after="150" w:before="300"/>
+      </w:pPr>
+      <w:r>
+        <w:t xml:space="preserve">Privacy — acknowledged, not built</w:t>
+      </w:r>
+    </w:p>
+    <w:p>
+      <w:pPr>
+        <w:spacing w:after="160"/>
+      </w:pPr>
+      <w:r>
+        <w:rPr>
+          <w:sz w:val="21"/>
+          <w:szCs w:val="21"/>
+        </w:rPr>
+        <w:t xml:space="preserve">The current dataset is synthetic shipment and purchase-order data with no real personal information, so this isn't an issue today. A production connection to live carrier and D365FO data would need PII handling appropriate to GDPR/EMEA data residency requirements before going live. This is flagged as a known next step, not glossed over.</w:t>
+      </w:r>
+    </w:p>
+    <w:p>
+      <w:r>
+        <w:br w:type="page"/>
+      </w:r>
+    </w:p>
+    <w:p>
+      <w:pPr>
+        <w:pStyle w:val="Heading1"/>
+        <w:spacing w:after="200" w:before="400"/>
+      </w:pPr>
+      <w:r>
+        <w:t xml:space="preserve">9. Scope — Built vs. Not Yet</w:t>
       </w:r>
     </w:p>
     <w:tbl>
@@ -3035,7 +3357,7 @@
                 <w:sz w:val="18"/>
                 <w:szCs w:val="18"/>
               </w:rPr>
-              <w:t xml:space="preserve">Data sources</w:t>
+              <w:t xml:space="preserve">Retry handling</w:t>
             </w:r>
           </w:p>
         </w:tc>
@@ -3056,7 +3378,7 @@
                 <w:sz w:val="18"/>
                 <w:szCs w:val="18"/>
               </w:rPr>
-              <w:t xml:space="preserve">Structured mock data shaped like the real thing — not yet a live carrier feed or D365FO connection.</w:t>
+              <w:t xml:space="preserve">Exponential backoff on transient API errors; auth/bad-request errors never retried.</w:t>
             </w:r>
           </w:p>
         </w:tc>
@@ -3079,7 +3401,7 @@
                 <w:sz w:val="18"/>
                 <w:szCs w:val="18"/>
               </w:rPr>
-              <w:t xml:space="preserve">Standing deployment</w:t>
+              <w:t xml:space="preserve">Data sources</w:t>
             </w:r>
           </w:p>
         </w:tc>
@@ -3100,7 +3422,95 @@
                 <w:sz w:val="18"/>
                 <w:szCs w:val="18"/>
               </w:rPr>
+              <w:t xml:space="preserve">Structured mock data shaped like the real thing — not yet a live carrier feed or D365FO connection.</w:t>
+            </w:r>
+          </w:p>
+        </w:tc>
+      </w:tr>
+      <w:tr>
+        <w:tc>
+          <w:tcPr>
+            <w:tcW w:type="dxa" w:w="2621"/>
+            <w:shd w:fill="F3F3F5" w:val="clear"/>
+            <w:tcMar>
+              <w:top w:type="dxa" w:w="100"/>
+              <w:left w:type="dxa" w:w="120"/>
+              <w:bottom w:type="dxa" w:w="100"/>
+              <w:right w:type="dxa" w:w="120"/>
+            </w:tcMar>
+          </w:tcPr>
+          <w:p>
+            <w:r>
+              <w:rPr>
+                <w:sz w:val="18"/>
+                <w:szCs w:val="18"/>
+              </w:rPr>
+              <w:t xml:space="preserve">Standing deployment</w:t>
+            </w:r>
+          </w:p>
+        </w:tc>
+        <w:tc>
+          <w:tcPr>
+            <w:tcW w:type="dxa" w:w="6739"/>
+            <w:shd w:fill="F3F3F5" w:val="clear"/>
+            <w:tcMar>
+              <w:top w:type="dxa" w:w="100"/>
+              <w:left w:type="dxa" w:w="120"/>
+              <w:bottom w:type="dxa" w:w="100"/>
+              <w:right w:type="dxa" w:w="120"/>
+            </w:tcMar>
+          </w:tcPr>
+          <w:p>
+            <w:r>
+              <w:rPr>
+                <w:sz w:val="18"/>
+                <w:szCs w:val="18"/>
+              </w:rPr>
               <w:t xml:space="preserve">Runs on demand today; production needs a schedule or event trigger.</w:t>
+            </w:r>
+          </w:p>
+        </w:tc>
+      </w:tr>
+      <w:tr>
+        <w:tc>
+          <w:tcPr>
+            <w:tcW w:type="dxa" w:w="2621"/>
+            <w:shd w:fill="FFFFFF" w:val="clear"/>
+            <w:tcMar>
+              <w:top w:type="dxa" w:w="100"/>
+              <w:left w:type="dxa" w:w="120"/>
+              <w:bottom w:type="dxa" w:w="100"/>
+              <w:right w:type="dxa" w:w="120"/>
+            </w:tcMar>
+          </w:tcPr>
+          <w:p>
+            <w:r>
+              <w:rPr>
+                <w:sz w:val="18"/>
+                <w:szCs w:val="18"/>
+              </w:rPr>
+              <w:t xml:space="preserve">Privacy / PII handling</w:t>
+            </w:r>
+          </w:p>
+        </w:tc>
+        <w:tc>
+          <w:tcPr>
+            <w:tcW w:type="dxa" w:w="6739"/>
+            <w:shd w:fill="FFFFFF" w:val="clear"/>
+            <w:tcMar>
+              <w:top w:type="dxa" w:w="100"/>
+              <w:left w:type="dxa" w:w="120"/>
+              <w:bottom w:type="dxa" w:w="100"/>
+              <w:right w:type="dxa" w:w="120"/>
+            </w:tcMar>
+          </w:tcPr>
+          <w:p>
+            <w:r>
+              <w:rPr>
+                <w:sz w:val="18"/>
+                <w:szCs w:val="18"/>
+              </w:rPr>
+              <w:t xml:space="preserve">Not needed for synthetic data today; required before connecting real carrier/D365FO data.</w:t>
             </w:r>
           </w:p>
         </w:tc>

</xml_diff>

<commit_message>
Embed real portal workflow screenshot in Supporting Documentation
Replaces the two placeholder boxes (workflow graph + successful Preview
run) with a single real screenshot that captures both: the full graph
with all nodes checkmarked, and the completed run's real ERP
reconciliation output for SHP-1003 (NordCold Distribution, EUR 41,200,
production_dependency=true). Only the Agents-list screenshot remains
outstanding. EVIDENCE.md checklist updated to match.

Co-Authored-By: Claude Sonnet 5 <noreply@anthropic.com>
</commit_message>
<xml_diff>
--- a/docs/CargoFlow_Sentinel_Supporting_Documentation.docx
+++ b/docs/CargoFlow_Sentinel_Supporting_Documentation.docx
@@ -189,7 +189,7 @@
         </w:rPr>
         <w:t xml:space="preserve">Full source code &amp; repository: </w:t>
       </w:r>
-      <w:hyperlink w:history="1" r:id="rIdmguf2sc_tsyus5aj903nb">
+      <w:hyperlink w:history="1" r:id="rIdr-peioodhmpjoouimhrmt">
         <w:r>
           <w:rPr>
             <w:b/>
@@ -1071,137 +1071,73 @@
         <w:t xml:space="preserve">Beyond the Python SDK orchestration (Section 4), the same three-agent chain with the same conditional logic was also built as a native Foundry Workflow (workflow name: cargoflow-sentinel-workflow), verified running end-to-end. This gives two independent, working proof paths rather than one.</w:t>
       </w:r>
     </w:p>
-    <w:tbl>
-      <w:tblPr>
-        <w:tblW w:type="pct" w:w="100%"/>
-        <w:tblBorders>
-          <w:top w:val="single" w:color="auto" w:sz="4"/>
-          <w:left w:val="single" w:color="auto" w:sz="4"/>
-          <w:bottom w:val="single" w:color="auto" w:sz="4"/>
-          <w:right w:val="single" w:color="auto" w:sz="4"/>
-          <w:insideH w:val="single" w:color="auto" w:sz="4"/>
-          <w:insideV w:val="single" w:color="auto" w:sz="4"/>
-        </w:tblBorders>
-      </w:tblPr>
-      <w:tblGrid>
-        <w:gridCol w:w="100"/>
-      </w:tblGrid>
-      <w:tr>
-        <w:tc>
-          <w:tcPr>
-            <w:tcW w:type="pct" w:w="100%"/>
-            <w:tcBorders>
-              <w:top w:val="dashed" w:color="B5691F" w:sz="8"/>
-              <w:left w:val="dashed" w:color="B5691F" w:sz="8"/>
-              <w:bottom w:val="dashed" w:color="B5691F" w:sz="8"/>
-              <w:right w:val="dashed" w:color="B5691F" w:sz="8"/>
-            </w:tcBorders>
-            <w:shd w:fill="F5F0E6" w:val="clear"/>
-            <w:tcMar>
-              <w:top w:type="dxa" w:w="200"/>
-              <w:left w:type="dxa" w:w="240"/>
-              <w:bottom w:type="dxa" w:w="200"/>
-              <w:right w:type="dxa" w:w="240"/>
-            </w:tcMar>
-          </w:tcPr>
-          <w:p>
-            <w:pPr>
-              <w:spacing w:after="80"/>
-            </w:pPr>
-            <w:r>
-              <w:rPr>
-                <w:b/>
-                <w:bCs/>
-                <w:color w:val="B5691F"/>
-                <w:sz w:val="21"/>
-                <w:szCs w:val="21"/>
-              </w:rPr>
-              <w:t xml:space="preserve">📷 INSERT SCREENSHOT: Workflow graph — full canvas</w:t>
-            </w:r>
-          </w:p>
-          <w:p>
-            <w:r>
-              <w:rPr>
-                <w:i/>
-                <w:iCs/>
-                <w:color w:val="54596A"/>
-                <w:sz w:val="19"/>
-                <w:szCs w:val="19"/>
-              </w:rPr>
-              <w:t xml:space="preserve">cargoflow-sentinel-workflow Build tab: Start → exception-detection-agent → root-cause-action-agent → If/else (CRITICAL check) → erp-reconciliation-agent → End, with the Else branch routing straight to End.</w:t>
-            </w:r>
-          </w:p>
-        </w:tc>
-      </w:tr>
-    </w:tbl>
-    <w:p>
-      <w:pPr>
-        <w:spacing w:after="200"/>
-      </w:pPr>
-    </w:p>
-    <w:tbl>
-      <w:tblPr>
-        <w:tblW w:type="pct" w:w="100%"/>
-        <w:tblBorders>
-          <w:top w:val="single" w:color="auto" w:sz="4"/>
-          <w:left w:val="single" w:color="auto" w:sz="4"/>
-          <w:bottom w:val="single" w:color="auto" w:sz="4"/>
-          <w:right w:val="single" w:color="auto" w:sz="4"/>
-          <w:insideH w:val="single" w:color="auto" w:sz="4"/>
-          <w:insideV w:val="single" w:color="auto" w:sz="4"/>
-        </w:tblBorders>
-      </w:tblPr>
-      <w:tblGrid>
-        <w:gridCol w:w="100"/>
-      </w:tblGrid>
-      <w:tr>
-        <w:tc>
-          <w:tcPr>
-            <w:tcW w:type="pct" w:w="100%"/>
-            <w:tcBorders>
-              <w:top w:val="dashed" w:color="B5691F" w:sz="8"/>
-              <w:left w:val="dashed" w:color="B5691F" w:sz="8"/>
-              <w:bottom w:val="dashed" w:color="B5691F" w:sz="8"/>
-              <w:right w:val="dashed" w:color="B5691F" w:sz="8"/>
-            </w:tcBorders>
-            <w:shd w:fill="F5F0E6" w:val="clear"/>
-            <w:tcMar>
-              <w:top w:type="dxa" w:w="200"/>
-              <w:left w:type="dxa" w:w="240"/>
-              <w:bottom w:type="dxa" w:w="200"/>
-              <w:right w:type="dxa" w:w="240"/>
-            </w:tcMar>
-          </w:tcPr>
-          <w:p>
-            <w:pPr>
-              <w:spacing w:after="80"/>
-            </w:pPr>
-            <w:r>
-              <w:rPr>
-                <w:b/>
-                <w:bCs/>
-                <w:color w:val="B5691F"/>
-                <w:sz w:val="21"/>
-                <w:szCs w:val="21"/>
-              </w:rPr>
-              <w:t xml:space="preserve">📷 INSERT SCREENSHOT: Successful Preview run</w:t>
-            </w:r>
-          </w:p>
-          <w:p>
-            <w:r>
-              <w:rPr>
-                <w:i/>
-                <w:iCs/>
-                <w:color w:val="54596A"/>
-                <w:sz w:val="19"/>
-                <w:szCs w:val="19"/>
-              </w:rPr>
-              <w:t xml:space="preserve">A completed Preview run showing the full chain execute, including the ERP Reconciliation step firing on the CRITICAL branch with real business-impact output.</w:t>
-            </w:r>
-          </w:p>
-        </w:tc>
-      </w:tr>
-    </w:tbl>
+    <w:p>
+      <w:pPr>
+        <w:pBdr>
+          <w:top w:val="single" w:color="D9DCE4" w:sz="4"/>
+          <w:bottom w:val="single" w:color="D9DCE4" w:sz="4"/>
+          <w:left w:val="single" w:color="D9DCE4" w:sz="4"/>
+          <w:right w:val="single" w:color="D9DCE4" w:sz="4"/>
+        </w:pBdr>
+        <w:spacing w:after="100"/>
+        <w:jc w:val="center"/>
+      </w:pPr>
+      <w:r>
+        <w:drawing>
+          <wp:inline distT="0" distB="0" distL="0" distR="0">
+            <wp:extent cx="5905500" cy="3019425"/>
+            <wp:effectExtent t="0" r="0" b="0" l="0"/>
+            <wp:docPr id="1" name="" descr="" title=""/>
+            <wp:cNvGraphicFramePr>
+              <a:graphicFrameLocks xmlns:a="http://schemas.openxmlformats.org/drawingml/2006/main" noChangeAspect="1"/>
+            </wp:cNvGraphicFramePr>
+            <a:graphic xmlns:a="http://schemas.openxmlformats.org/drawingml/2006/main">
+              <a:graphicData uri="http://schemas.openxmlformats.org/drawingml/2006/picture">
+                <pic:pic xmlns:pic="http://schemas.openxmlformats.org/drawingml/2006/picture">
+                  <pic:nvPicPr>
+                    <pic:cNvPr id="0" name="" descr=""/>
+                    <pic:cNvPicPr>
+                      <a:picLocks noChangeAspect="1" noChangeArrowheads="1"/>
+                    </pic:cNvPicPr>
+                  </pic:nvPicPr>
+                  <pic:blipFill>
+                    <a:blip r:embed="rId8" cstate="none"/>
+                    <a:srcRect/>
+                    <a:stretch>
+                      <a:fillRect/>
+                    </a:stretch>
+                  </pic:blipFill>
+                  <pic:spPr bwMode="auto">
+                    <a:xfrm>
+                      <a:off x="0" y="0"/>
+                      <a:ext cx="5905500" cy="3019425"/>
+                    </a:xfrm>
+                    <a:prstGeom prst="rect">
+                      <a:avLst/>
+                    </a:prstGeom>
+                  </pic:spPr>
+                </pic:pic>
+              </a:graphicData>
+            </a:graphic>
+          </wp:inline>
+        </w:drawing>
+      </w:r>
+    </w:p>
+    <w:p>
+      <w:pPr>
+        <w:spacing w:after="160"/>
+      </w:pPr>
+      <w:r>
+        <w:rPr>
+          <w:i/>
+          <w:iCs/>
+          <w:color w:val="54596A"/>
+          <w:sz w:val="18"/>
+          <w:szCs w:val="18"/>
+        </w:rPr>
+        <w:t xml:space="preserve">Figure: the full workflow graph (Start → exception-detection-agent → root-cause-action-agent → If/else → erp-reconciliation-agent → End, all nodes checkmarked) alongside a completed Preview run's real output — including the ERP Reconciliation step's business-impact result for SHP-1003 (NordCold Distribution, €41,200, production_dependency=true, urgent escalation).</w:t>
+      </w:r>
+    </w:p>
     <w:p>
       <w:r>
         <w:br w:type="page"/>

</xml_diff>

<commit_message>
Embed final screenshot -- Supporting Documentation now fully complete
Agents-list screenshot embedded in Section 2, replacing the last
placeholder box. All three required screenshots are now real, embedded
images. EVIDENCE.md checklist closed out.

Co-Authored-By: Claude Sonnet 5 <noreply@anthropic.com>
</commit_message>
<xml_diff>
--- a/docs/CargoFlow_Sentinel_Supporting_Documentation.docx
+++ b/docs/CargoFlow_Sentinel_Supporting_Documentation.docx
@@ -189,7 +189,7 @@
         </w:rPr>
         <w:t xml:space="preserve">Full source code &amp; repository: </w:t>
       </w:r>
-      <w:hyperlink w:history="1" r:id="rIdr-peioodhmpjoouimhrmt">
+      <w:hyperlink w:history="1" r:id="rId4y4wbxynvnoan8bcb3mbd">
         <w:r>
           <w:rPr>
             <w:b/>
@@ -982,69 +982,73 @@
         <w:spacing w:after="200"/>
       </w:pPr>
     </w:p>
-    <w:tbl>
-      <w:tblPr>
-        <w:tblW w:type="pct" w:w="100%"/>
-        <w:tblBorders>
-          <w:top w:val="single" w:color="auto" w:sz="4"/>
-          <w:left w:val="single" w:color="auto" w:sz="4"/>
-          <w:bottom w:val="single" w:color="auto" w:sz="4"/>
-          <w:right w:val="single" w:color="auto" w:sz="4"/>
-          <w:insideH w:val="single" w:color="auto" w:sz="4"/>
-          <w:insideV w:val="single" w:color="auto" w:sz="4"/>
-        </w:tblBorders>
-      </w:tblPr>
-      <w:tblGrid>
-        <w:gridCol w:w="100"/>
-      </w:tblGrid>
-      <w:tr>
-        <w:tc>
-          <w:tcPr>
-            <w:tcW w:type="pct" w:w="100%"/>
-            <w:tcBorders>
-              <w:top w:val="dashed" w:color="B5691F" w:sz="8"/>
-              <w:left w:val="dashed" w:color="B5691F" w:sz="8"/>
-              <w:bottom w:val="dashed" w:color="B5691F" w:sz="8"/>
-              <w:right w:val="dashed" w:color="B5691F" w:sz="8"/>
-            </w:tcBorders>
-            <w:shd w:fill="F5F0E6" w:val="clear"/>
-            <w:tcMar>
-              <w:top w:type="dxa" w:w="200"/>
-              <w:left w:type="dxa" w:w="240"/>
-              <w:bottom w:type="dxa" w:w="200"/>
-              <w:right w:type="dxa" w:w="240"/>
-            </w:tcMar>
-          </w:tcPr>
-          <w:p>
-            <w:pPr>
-              <w:spacing w:after="80"/>
-            </w:pPr>
-            <w:r>
-              <w:rPr>
-                <w:b/>
-                <w:bCs/>
-                <w:color w:val="B5691F"/>
-                <w:sz w:val="21"/>
-                <w:szCs w:val="21"/>
-              </w:rPr>
-              <w:t xml:space="preserve">📷 INSERT SCREENSHOT: Foundry Agents list</w:t>
-            </w:r>
-          </w:p>
-          <w:p>
-            <w:r>
-              <w:rPr>
-                <w:i/>
-                <w:iCs/>
-                <w:color w:val="54596A"/>
-                <w:sz w:val="19"/>
-                <w:szCs w:val="19"/>
-              </w:rPr>
-              <w:t xml:space="preserve">The project's Agents page showing all three deployed: exception-detection-agent, root-cause-action-agent, erp-reconciliation-agent (Build tab in the Foundry portal).</w:t>
-            </w:r>
-          </w:p>
-        </w:tc>
-      </w:tr>
-    </w:tbl>
+    <w:p>
+      <w:pPr>
+        <w:pBdr>
+          <w:top w:val="single" w:color="D9DCE4" w:sz="4"/>
+          <w:bottom w:val="single" w:color="D9DCE4" w:sz="4"/>
+          <w:left w:val="single" w:color="D9DCE4" w:sz="4"/>
+          <w:right w:val="single" w:color="D9DCE4" w:sz="4"/>
+        </w:pBdr>
+        <w:spacing w:after="100"/>
+        <w:jc w:val="center"/>
+      </w:pPr>
+      <w:r>
+        <w:drawing>
+          <wp:inline distT="0" distB="0" distL="0" distR="0">
+            <wp:extent cx="5905500" cy="1266825"/>
+            <wp:effectExtent t="0" r="0" b="0" l="0"/>
+            <wp:docPr id="1" name="" descr="" title=""/>
+            <wp:cNvGraphicFramePr>
+              <a:graphicFrameLocks xmlns:a="http://schemas.openxmlformats.org/drawingml/2006/main" noChangeAspect="1"/>
+            </wp:cNvGraphicFramePr>
+            <a:graphic xmlns:a="http://schemas.openxmlformats.org/drawingml/2006/main">
+              <a:graphicData uri="http://schemas.openxmlformats.org/drawingml/2006/picture">
+                <pic:pic xmlns:pic="http://schemas.openxmlformats.org/drawingml/2006/picture">
+                  <pic:nvPicPr>
+                    <pic:cNvPr id="0" name="" descr=""/>
+                    <pic:cNvPicPr>
+                      <a:picLocks noChangeAspect="1" noChangeArrowheads="1"/>
+                    </pic:cNvPicPr>
+                  </pic:nvPicPr>
+                  <pic:blipFill>
+                    <a:blip r:embed="rId8" cstate="none"/>
+                    <a:srcRect/>
+                    <a:stretch>
+                      <a:fillRect/>
+                    </a:stretch>
+                  </pic:blipFill>
+                  <pic:spPr bwMode="auto">
+                    <a:xfrm>
+                      <a:off x="0" y="0"/>
+                      <a:ext cx="5905500" cy="1266825"/>
+                    </a:xfrm>
+                    <a:prstGeom prst="rect">
+                      <a:avLst/>
+                    </a:prstGeom>
+                  </pic:spPr>
+                </pic:pic>
+              </a:graphicData>
+            </a:graphic>
+          </wp:inline>
+        </w:drawing>
+      </w:r>
+    </w:p>
+    <w:p>
+      <w:pPr>
+        <w:spacing w:after="160"/>
+      </w:pPr>
+      <w:r>
+        <w:rPr>
+          <w:i/>
+          <w:iCs/>
+          <w:color w:val="54596A"/>
+          <w:sz w:val="18"/>
+          <w:szCs w:val="18"/>
+        </w:rPr>
+        <w:t xml:space="preserve">Figure: the Foundry portal's Agents page, Build tab — all three CargoFlow Sentinel agents deployed and Running (erp-reconciliation-agent, exception-detection-agent, root-cause-action-agent).</w:t>
+      </w:r>
+    </w:p>
     <w:p>
       <w:r>
         <w:br w:type="page"/>
@@ -1101,7 +1105,7 @@
                     </pic:cNvPicPr>
                   </pic:nvPicPr>
                   <pic:blipFill>
-                    <a:blip r:embed="rId8" cstate="none"/>
+                    <a:blip r:embed="rId9" cstate="none"/>
                     <a:srcRect/>
                     <a:stretch>
                       <a:fillRect/>

</xml_diff>